<commit_message>
Add marketing and advertising timeline to kickoff sheet
Social accounts and organic content start during the build (free); paid
Facebook/Instagram ads begin at launch with an indicative monthly budget,
and Google Ads from month 3. Notes that ad accounts are company-owned and
company-funded, managed by the systems manager.

Co-Authored-By: Claude Fable 5 <noreply@anthropic.com>
Claude-Session: https://claude.ai/code/session_015uk3TKTdhCd7sJHXgfZUnu
</commit_message>
<xml_diff>
--- a/docs/enterprise-proposal/Project_Kickoff_Sheet.docx
+++ b/docs/enterprise-proposal/Project_Kickoff_Sheet.docx
@@ -1660,7 +1660,603 @@
           <w:sz w:val="26"/>
           <w:szCs w:val="26"/>
         </w:rPr>
-        <w:t xml:space="preserve">4. What comes after launch</w:t>
+        <w:t xml:space="preserve">4. Marketing &amp; advertising timeline</w:t>
+      </w:r>
+    </w:p>
+    <w:p>
+      <w:pPr>
+        <w:spacing w:after="110" w:line="270"/>
+      </w:pPr>
+      <w:r>
+        <w:rPr>
+          <w:rFonts w:ascii="Calibri" w:cs="Calibri" w:eastAsia="Calibri" w:hAnsi="Calibri"/>
+          <w:i/>
+          <w:iCs/>
+          <w:color w:val="5C6B7A"/>
+          <w:sz w:val="19"/>
+          <w:szCs w:val="19"/>
+        </w:rPr>
+        <w:t xml:space="preserve">Social media starts on day one because it is free and builds an audience while the platform is built. Paid advertising starts only at launch — ads before there is a website to book on waste money.</w:t>
+      </w:r>
+    </w:p>
+    <w:tbl>
+      <w:tblPr>
+        <w:tblW w:type="dxa" w:w="9638"/>
+        <w:tblBorders>
+          <w:top w:val="single" w:color="auto" w:sz="4"/>
+          <w:left w:val="single" w:color="auto" w:sz="4"/>
+          <w:bottom w:val="single" w:color="auto" w:sz="4"/>
+          <w:right w:val="single" w:color="auto" w:sz="4"/>
+          <w:insideH w:val="single" w:color="auto" w:sz="4"/>
+          <w:insideV w:val="single" w:color="auto" w:sz="4"/>
+        </w:tblBorders>
+      </w:tblPr>
+      <w:tblGrid>
+        <w:gridCol w:w="1900"/>
+        <w:gridCol w:w="5000"/>
+        <w:gridCol w:w="2738"/>
+      </w:tblGrid>
+      <w:tr>
+        <w:trPr>
+          <w:tblHeader/>
+        </w:trPr>
+        <w:tc>
+          <w:tcPr>
+            <w:tcW w:type="dxa" w:w="1900"/>
+            <w:tcBorders>
+              <w:top w:val="single" w:color="C9CFD6" w:sz="4"/>
+              <w:left w:val="single" w:color="C9CFD6" w:sz="4"/>
+              <w:bottom w:val="single" w:color="C9CFD6" w:sz="4"/>
+              <w:right w:val="single" w:color="C9CFD6" w:sz="4"/>
+            </w:tcBorders>
+            <w:shd w:fill="1F2733" w:val="clear"/>
+            <w:tcMar>
+              <w:top w:type="dxa" w:w="70"/>
+              <w:left w:type="dxa" w:w="110"/>
+              <w:bottom w:type="dxa" w:w="70"/>
+              <w:right w:type="dxa" w:w="110"/>
+            </w:tcMar>
+            <w:vAlign w:val="center"/>
+          </w:tcPr>
+          <w:p>
+            <w:pPr>
+              <w:spacing w:after="0"/>
+            </w:pPr>
+            <w:r>
+              <w:rPr>
+                <w:rFonts w:ascii="Calibri" w:cs="Calibri" w:eastAsia="Calibri" w:hAnsi="Calibri"/>
+                <w:b/>
+                <w:bCs/>
+                <w:color w:val="FFFFFF"/>
+                <w:sz w:val="19"/>
+                <w:szCs w:val="19"/>
+              </w:rPr>
+              <w:t xml:space="preserve">When</w:t>
+            </w:r>
+          </w:p>
+        </w:tc>
+        <w:tc>
+          <w:tcPr>
+            <w:tcW w:type="dxa" w:w="5000"/>
+            <w:tcBorders>
+              <w:top w:val="single" w:color="C9CFD6" w:sz="4"/>
+              <w:left w:val="single" w:color="C9CFD6" w:sz="4"/>
+              <w:bottom w:val="single" w:color="C9CFD6" w:sz="4"/>
+              <w:right w:val="single" w:color="C9CFD6" w:sz="4"/>
+            </w:tcBorders>
+            <w:shd w:fill="1F2733" w:val="clear"/>
+            <w:tcMar>
+              <w:top w:type="dxa" w:w="70"/>
+              <w:left w:type="dxa" w:w="110"/>
+              <w:bottom w:type="dxa" w:w="70"/>
+              <w:right w:type="dxa" w:w="110"/>
+            </w:tcMar>
+            <w:vAlign w:val="center"/>
+          </w:tcPr>
+          <w:p>
+            <w:pPr>
+              <w:spacing w:after="0"/>
+            </w:pPr>
+            <w:r>
+              <w:rPr>
+                <w:rFonts w:ascii="Calibri" w:cs="Calibri" w:eastAsia="Calibri" w:hAnsi="Calibri"/>
+                <w:b/>
+                <w:bCs/>
+                <w:color w:val="FFFFFF"/>
+                <w:sz w:val="19"/>
+                <w:szCs w:val="19"/>
+              </w:rPr>
+              <w:t xml:space="preserve">Marketing activity</w:t>
+            </w:r>
+          </w:p>
+        </w:tc>
+        <w:tc>
+          <w:tcPr>
+            <w:tcW w:type="dxa" w:w="2738"/>
+            <w:tcBorders>
+              <w:top w:val="single" w:color="C9CFD6" w:sz="4"/>
+              <w:left w:val="single" w:color="C9CFD6" w:sz="4"/>
+              <w:bottom w:val="single" w:color="C9CFD6" w:sz="4"/>
+              <w:right w:val="single" w:color="C9CFD6" w:sz="4"/>
+            </w:tcBorders>
+            <w:shd w:fill="1F2733" w:val="clear"/>
+            <w:tcMar>
+              <w:top w:type="dxa" w:w="70"/>
+              <w:left w:type="dxa" w:w="110"/>
+              <w:bottom w:type="dxa" w:w="70"/>
+              <w:right w:type="dxa" w:w="110"/>
+            </w:tcMar>
+            <w:vAlign w:val="center"/>
+          </w:tcPr>
+          <w:p>
+            <w:pPr>
+              <w:spacing w:after="0"/>
+            </w:pPr>
+            <w:r>
+              <w:rPr>
+                <w:rFonts w:ascii="Calibri" w:cs="Calibri" w:eastAsia="Calibri" w:hAnsi="Calibri"/>
+                <w:b/>
+                <w:bCs/>
+                <w:color w:val="FFFFFF"/>
+                <w:sz w:val="19"/>
+                <w:szCs w:val="19"/>
+              </w:rPr>
+              <w:t xml:space="preserve">Cost</w:t>
+            </w:r>
+          </w:p>
+        </w:tc>
+      </w:tr>
+      <w:tr>
+        <w:tc>
+          <w:tcPr>
+            <w:tcW w:type="dxa" w:w="1900"/>
+            <w:tcBorders>
+              <w:top w:val="single" w:color="C9CFD6" w:sz="4"/>
+              <w:left w:val="single" w:color="C9CFD6" w:sz="4"/>
+              <w:bottom w:val="single" w:color="C9CFD6" w:sz="4"/>
+              <w:right w:val="single" w:color="C9CFD6" w:sz="4"/>
+            </w:tcBorders>
+            <w:tcMar>
+              <w:top w:type="dxa" w:w="60"/>
+              <w:left w:type="dxa" w:w="110"/>
+              <w:bottom w:type="dxa" w:w="60"/>
+              <w:right w:type="dxa" w:w="110"/>
+            </w:tcMar>
+            <w:vAlign w:val="center"/>
+          </w:tcPr>
+          <w:p>
+            <w:pPr>
+              <w:spacing w:after="0" w:line="250"/>
+            </w:pPr>
+            <w:r>
+              <w:rPr>
+                <w:rFonts w:ascii="Calibri" w:cs="Calibri" w:eastAsia="Calibri" w:hAnsi="Calibri"/>
+                <w:b/>
+                <w:bCs/>
+                <w:color w:val="2A2A2A"/>
+                <w:sz w:val="19"/>
+                <w:szCs w:val="19"/>
+              </w:rPr>
+              <w:t xml:space="preserve">Weeks 1–2</w:t>
+            </w:r>
+          </w:p>
+        </w:tc>
+        <w:tc>
+          <w:tcPr>
+            <w:tcW w:type="dxa" w:w="5000"/>
+            <w:tcBorders>
+              <w:top w:val="single" w:color="C9CFD6" w:sz="4"/>
+              <w:left w:val="single" w:color="C9CFD6" w:sz="4"/>
+              <w:bottom w:val="single" w:color="C9CFD6" w:sz="4"/>
+              <w:right w:val="single" w:color="C9CFD6" w:sz="4"/>
+            </w:tcBorders>
+            <w:tcMar>
+              <w:top w:type="dxa" w:w="60"/>
+              <w:left w:type="dxa" w:w="110"/>
+              <w:bottom w:type="dxa" w:w="60"/>
+              <w:right w:type="dxa" w:w="110"/>
+            </w:tcMar>
+            <w:vAlign w:val="center"/>
+          </w:tcPr>
+          <w:p>
+            <w:pPr>
+              <w:spacing w:after="0" w:line="250"/>
+            </w:pPr>
+            <w:r>
+              <w:rPr>
+                <w:rFonts w:ascii="Calibri" w:cs="Calibri" w:eastAsia="Calibri" w:hAnsi="Calibri"/>
+                <w:b w:val="false"/>
+                <w:bCs w:val="false"/>
+                <w:color w:val="2A2A2A"/>
+                <w:sz w:val="19"/>
+                <w:szCs w:val="19"/>
+              </w:rPr>
+              <w:t xml:space="preserve">Create company accounts: Facebook, Instagram, TikTok, LinkedIn, WhatsApp Business, Google Business Profile — reserve the name everywhere</w:t>
+            </w:r>
+          </w:p>
+        </w:tc>
+        <w:tc>
+          <w:tcPr>
+            <w:tcW w:type="dxa" w:w="2738"/>
+            <w:tcBorders>
+              <w:top w:val="single" w:color="C9CFD6" w:sz="4"/>
+              <w:left w:val="single" w:color="C9CFD6" w:sz="4"/>
+              <w:bottom w:val="single" w:color="C9CFD6" w:sz="4"/>
+              <w:right w:val="single" w:color="C9CFD6" w:sz="4"/>
+            </w:tcBorders>
+            <w:tcMar>
+              <w:top w:type="dxa" w:w="60"/>
+              <w:left w:type="dxa" w:w="110"/>
+              <w:bottom w:type="dxa" w:w="60"/>
+              <w:right w:type="dxa" w:w="110"/>
+            </w:tcMar>
+            <w:vAlign w:val="center"/>
+          </w:tcPr>
+          <w:p>
+            <w:pPr>
+              <w:spacing w:after="0" w:line="250"/>
+            </w:pPr>
+            <w:r>
+              <w:rPr>
+                <w:rFonts w:ascii="Calibri" w:cs="Calibri" w:eastAsia="Calibri" w:hAnsi="Calibri"/>
+                <w:b w:val="false"/>
+                <w:bCs w:val="false"/>
+                <w:color w:val="2A2A2A"/>
+                <w:sz w:val="19"/>
+                <w:szCs w:val="19"/>
+              </w:rPr>
+              <w:t xml:space="preserve">Free</w:t>
+            </w:r>
+          </w:p>
+        </w:tc>
+      </w:tr>
+      <w:tr>
+        <w:tc>
+          <w:tcPr>
+            <w:tcW w:type="dxa" w:w="1900"/>
+            <w:tcBorders>
+              <w:top w:val="single" w:color="C9CFD6" w:sz="4"/>
+              <w:left w:val="single" w:color="C9CFD6" w:sz="4"/>
+              <w:bottom w:val="single" w:color="C9CFD6" w:sz="4"/>
+              <w:right w:val="single" w:color="C9CFD6" w:sz="4"/>
+            </w:tcBorders>
+            <w:shd w:fill="F2F4F7" w:val="clear"/>
+            <w:tcMar>
+              <w:top w:type="dxa" w:w="60"/>
+              <w:left w:type="dxa" w:w="110"/>
+              <w:bottom w:type="dxa" w:w="60"/>
+              <w:right w:type="dxa" w:w="110"/>
+            </w:tcMar>
+            <w:vAlign w:val="center"/>
+          </w:tcPr>
+          <w:p>
+            <w:pPr>
+              <w:spacing w:after="0" w:line="250"/>
+            </w:pPr>
+            <w:r>
+              <w:rPr>
+                <w:rFonts w:ascii="Calibri" w:cs="Calibri" w:eastAsia="Calibri" w:hAnsi="Calibri"/>
+                <w:b/>
+                <w:bCs/>
+                <w:color w:val="2A2A2A"/>
+                <w:sz w:val="19"/>
+                <w:szCs w:val="19"/>
+              </w:rPr>
+              <w:t xml:space="preserve">Weeks 3–7</w:t>
+            </w:r>
+          </w:p>
+        </w:tc>
+        <w:tc>
+          <w:tcPr>
+            <w:tcW w:type="dxa" w:w="5000"/>
+            <w:tcBorders>
+              <w:top w:val="single" w:color="C9CFD6" w:sz="4"/>
+              <w:left w:val="single" w:color="C9CFD6" w:sz="4"/>
+              <w:bottom w:val="single" w:color="C9CFD6" w:sz="4"/>
+              <w:right w:val="single" w:color="C9CFD6" w:sz="4"/>
+            </w:tcBorders>
+            <w:shd w:fill="F2F4F7" w:val="clear"/>
+            <w:tcMar>
+              <w:top w:type="dxa" w:w="60"/>
+              <w:left w:type="dxa" w:w="110"/>
+              <w:bottom w:type="dxa" w:w="60"/>
+              <w:right w:type="dxa" w:w="110"/>
+            </w:tcMar>
+            <w:vAlign w:val="center"/>
+          </w:tcPr>
+          <w:p>
+            <w:pPr>
+              <w:spacing w:after="0" w:line="250"/>
+            </w:pPr>
+            <w:r>
+              <w:rPr>
+                <w:rFonts w:ascii="Calibri" w:cs="Calibri" w:eastAsia="Calibri" w:hAnsi="Calibri"/>
+                <w:b w:val="false"/>
+                <w:bCs w:val="false"/>
+                <w:color w:val="2A2A2A"/>
+                <w:sz w:val="19"/>
+                <w:szCs w:val="19"/>
+              </w:rPr>
+              <w:t xml:space="preserve">Organic content: machine photos &amp; videos, job-site clips, behind-the-scenes — 2–3 posts per week building an audience before launch</w:t>
+            </w:r>
+          </w:p>
+        </w:tc>
+        <w:tc>
+          <w:tcPr>
+            <w:tcW w:type="dxa" w:w="2738"/>
+            <w:tcBorders>
+              <w:top w:val="single" w:color="C9CFD6" w:sz="4"/>
+              <w:left w:val="single" w:color="C9CFD6" w:sz="4"/>
+              <w:bottom w:val="single" w:color="C9CFD6" w:sz="4"/>
+              <w:right w:val="single" w:color="C9CFD6" w:sz="4"/>
+            </w:tcBorders>
+            <w:shd w:fill="F2F4F7" w:val="clear"/>
+            <w:tcMar>
+              <w:top w:type="dxa" w:w="60"/>
+              <w:left w:type="dxa" w:w="110"/>
+              <w:bottom w:type="dxa" w:w="60"/>
+              <w:right w:type="dxa" w:w="110"/>
+            </w:tcMar>
+            <w:vAlign w:val="center"/>
+          </w:tcPr>
+          <w:p>
+            <w:pPr>
+              <w:spacing w:after="0" w:line="250"/>
+            </w:pPr>
+            <w:r>
+              <w:rPr>
+                <w:rFonts w:ascii="Calibri" w:cs="Calibri" w:eastAsia="Calibri" w:hAnsi="Calibri"/>
+                <w:b w:val="false"/>
+                <w:bCs w:val="false"/>
+                <w:color w:val="2A2A2A"/>
+                <w:sz w:val="19"/>
+                <w:szCs w:val="19"/>
+              </w:rPr>
+              <w:t xml:space="preserve">Free</w:t>
+            </w:r>
+          </w:p>
+        </w:tc>
+      </w:tr>
+      <w:tr>
+        <w:tc>
+          <w:tcPr>
+            <w:tcW w:type="dxa" w:w="1900"/>
+            <w:tcBorders>
+              <w:top w:val="single" w:color="C9CFD6" w:sz="4"/>
+              <w:left w:val="single" w:color="C9CFD6" w:sz="4"/>
+              <w:bottom w:val="single" w:color="C9CFD6" w:sz="4"/>
+              <w:right w:val="single" w:color="C9CFD6" w:sz="4"/>
+            </w:tcBorders>
+            <w:tcMar>
+              <w:top w:type="dxa" w:w="60"/>
+              <w:left w:type="dxa" w:w="110"/>
+              <w:bottom w:type="dxa" w:w="60"/>
+              <w:right w:type="dxa" w:w="110"/>
+            </w:tcMar>
+            <w:vAlign w:val="center"/>
+          </w:tcPr>
+          <w:p>
+            <w:pPr>
+              <w:spacing w:after="0" w:line="250"/>
+            </w:pPr>
+            <w:r>
+              <w:rPr>
+                <w:rFonts w:ascii="Calibri" w:cs="Calibri" w:eastAsia="Calibri" w:hAnsi="Calibri"/>
+                <w:b/>
+                <w:bCs/>
+                <w:color w:val="2A2A2A"/>
+                <w:sz w:val="19"/>
+                <w:szCs w:val="19"/>
+              </w:rPr>
+              <w:t xml:space="preserve">Week 8 — LAUNCH</w:t>
+            </w:r>
+          </w:p>
+        </w:tc>
+        <w:tc>
+          <w:tcPr>
+            <w:tcW w:type="dxa" w:w="5000"/>
+            <w:tcBorders>
+              <w:top w:val="single" w:color="C9CFD6" w:sz="4"/>
+              <w:left w:val="single" w:color="C9CFD6" w:sz="4"/>
+              <w:bottom w:val="single" w:color="C9CFD6" w:sz="4"/>
+              <w:right w:val="single" w:color="C9CFD6" w:sz="4"/>
+            </w:tcBorders>
+            <w:tcMar>
+              <w:top w:type="dxa" w:w="60"/>
+              <w:left w:type="dxa" w:w="110"/>
+              <w:bottom w:type="dxa" w:w="60"/>
+              <w:right w:type="dxa" w:w="110"/>
+            </w:tcMar>
+            <w:vAlign w:val="center"/>
+          </w:tcPr>
+          <w:p>
+            <w:pPr>
+              <w:spacing w:after="0" w:line="250"/>
+            </w:pPr>
+            <w:r>
+              <w:rPr>
+                <w:rFonts w:ascii="Calibri" w:cs="Calibri" w:eastAsia="Calibri" w:hAnsi="Calibri"/>
+                <w:b w:val="false"/>
+                <w:bCs w:val="false"/>
+                <w:color w:val="2A2A2A"/>
+                <w:sz w:val="19"/>
+                <w:szCs w:val="19"/>
+              </w:rPr>
+              <w:t xml:space="preserve">Paid ads begin: Facebook &amp; Instagram campaigns + boosted posts sending customers to the new website</w:t>
+            </w:r>
+          </w:p>
+        </w:tc>
+        <w:tc>
+          <w:tcPr>
+            <w:tcW w:type="dxa" w:w="2738"/>
+            <w:tcBorders>
+              <w:top w:val="single" w:color="C9CFD6" w:sz="4"/>
+              <w:left w:val="single" w:color="C9CFD6" w:sz="4"/>
+              <w:bottom w:val="single" w:color="C9CFD6" w:sz="4"/>
+              <w:right w:val="single" w:color="C9CFD6" w:sz="4"/>
+            </w:tcBorders>
+            <w:tcMar>
+              <w:top w:type="dxa" w:w="60"/>
+              <w:left w:type="dxa" w:w="110"/>
+              <w:bottom w:type="dxa" w:w="60"/>
+              <w:right w:type="dxa" w:w="110"/>
+            </w:tcMar>
+            <w:vAlign w:val="center"/>
+          </w:tcPr>
+          <w:p>
+            <w:pPr>
+              <w:spacing w:after="0" w:line="250"/>
+            </w:pPr>
+            <w:r>
+              <w:rPr>
+                <w:rFonts w:ascii="Calibri" w:cs="Calibri" w:eastAsia="Calibri" w:hAnsi="Calibri"/>
+                <w:b w:val="false"/>
+                <w:bCs w:val="false"/>
+                <w:color w:val="2A2A2A"/>
+                <w:sz w:val="19"/>
+                <w:szCs w:val="19"/>
+              </w:rPr>
+              <w:t xml:space="preserve">GHS 1,500–3,000 /month</w:t>
+            </w:r>
+          </w:p>
+        </w:tc>
+      </w:tr>
+      <w:tr>
+        <w:tc>
+          <w:tcPr>
+            <w:tcW w:type="dxa" w:w="1900"/>
+            <w:tcBorders>
+              <w:top w:val="single" w:color="C9CFD6" w:sz="4"/>
+              <w:left w:val="single" w:color="C9CFD6" w:sz="4"/>
+              <w:bottom w:val="single" w:color="C9CFD6" w:sz="4"/>
+              <w:right w:val="single" w:color="C9CFD6" w:sz="4"/>
+            </w:tcBorders>
+            <w:shd w:fill="F2F4F7" w:val="clear"/>
+            <w:tcMar>
+              <w:top w:type="dxa" w:w="60"/>
+              <w:left w:type="dxa" w:w="110"/>
+              <w:bottom w:type="dxa" w:w="60"/>
+              <w:right w:type="dxa" w:w="110"/>
+            </w:tcMar>
+            <w:vAlign w:val="center"/>
+          </w:tcPr>
+          <w:p>
+            <w:pPr>
+              <w:spacing w:after="0" w:line="250"/>
+            </w:pPr>
+            <w:r>
+              <w:rPr>
+                <w:rFonts w:ascii="Calibri" w:cs="Calibri" w:eastAsia="Calibri" w:hAnsi="Calibri"/>
+                <w:b/>
+                <w:bCs/>
+                <w:color w:val="2A2A2A"/>
+                <w:sz w:val="19"/>
+                <w:szCs w:val="19"/>
+              </w:rPr>
+              <w:t xml:space="preserve">Month 3+</w:t>
+            </w:r>
+          </w:p>
+        </w:tc>
+        <w:tc>
+          <w:tcPr>
+            <w:tcW w:type="dxa" w:w="5000"/>
+            <w:tcBorders>
+              <w:top w:val="single" w:color="C9CFD6" w:sz="4"/>
+              <w:left w:val="single" w:color="C9CFD6" w:sz="4"/>
+              <w:bottom w:val="single" w:color="C9CFD6" w:sz="4"/>
+              <w:right w:val="single" w:color="C9CFD6" w:sz="4"/>
+            </w:tcBorders>
+            <w:shd w:fill="F2F4F7" w:val="clear"/>
+            <w:tcMar>
+              <w:top w:type="dxa" w:w="60"/>
+              <w:left w:type="dxa" w:w="110"/>
+              <w:bottom w:type="dxa" w:w="60"/>
+              <w:right w:type="dxa" w:w="110"/>
+            </w:tcMar>
+            <w:vAlign w:val="center"/>
+          </w:tcPr>
+          <w:p>
+            <w:pPr>
+              <w:spacing w:after="0" w:line="250"/>
+            </w:pPr>
+            <w:r>
+              <w:rPr>
+                <w:rFonts w:ascii="Calibri" w:cs="Calibri" w:eastAsia="Calibri" w:hAnsi="Calibri"/>
+                <w:b w:val="false"/>
+                <w:bCs w:val="false"/>
+                <w:color w:val="2A2A2A"/>
+                <w:sz w:val="19"/>
+                <w:szCs w:val="19"/>
+              </w:rPr>
+              <w:t xml:space="preserve">Add Google Ads for searches like “excavator rental Ghana”; scale only the ads that bring actual bookings</w:t>
+            </w:r>
+          </w:p>
+        </w:tc>
+        <w:tc>
+          <w:tcPr>
+            <w:tcW w:type="dxa" w:w="2738"/>
+            <w:tcBorders>
+              <w:top w:val="single" w:color="C9CFD6" w:sz="4"/>
+              <w:left w:val="single" w:color="C9CFD6" w:sz="4"/>
+              <w:bottom w:val="single" w:color="C9CFD6" w:sz="4"/>
+              <w:right w:val="single" w:color="C9CFD6" w:sz="4"/>
+            </w:tcBorders>
+            <w:shd w:fill="F2F4F7" w:val="clear"/>
+            <w:tcMar>
+              <w:top w:type="dxa" w:w="60"/>
+              <w:left w:type="dxa" w:w="110"/>
+              <w:bottom w:type="dxa" w:w="60"/>
+              <w:right w:type="dxa" w:w="110"/>
+            </w:tcMar>
+            <w:vAlign w:val="center"/>
+          </w:tcPr>
+          <w:p>
+            <w:pPr>
+              <w:spacing w:after="0" w:line="250"/>
+            </w:pPr>
+            <w:r>
+              <w:rPr>
+                <w:rFonts w:ascii="Calibri" w:cs="Calibri" w:eastAsia="Calibri" w:hAnsi="Calibri"/>
+                <w:b w:val="false"/>
+                <w:bCs w:val="false"/>
+                <w:color w:val="2A2A2A"/>
+                <w:sz w:val="19"/>
+                <w:szCs w:val="19"/>
+              </w:rPr>
+              <w:t xml:space="preserve">Budget grows with results</w:t>
+            </w:r>
+          </w:p>
+        </w:tc>
+      </w:tr>
+    </w:tbl>
+    <w:p>
+      <w:pPr>
+        <w:spacing w:after="110" w:line="270"/>
+      </w:pPr>
+      <w:r>
+        <w:rPr>
+          <w:rFonts w:ascii="Calibri" w:cs="Calibri" w:eastAsia="Calibri" w:hAnsi="Calibri"/>
+          <w:color w:val="5C6B7A"/>
+          <w:sz w:val="19"/>
+          <w:szCs w:val="19"/>
+        </w:rPr>
+        <w:t xml:space="preserve">All ad accounts are opened in the company's name and funded by the company's own card — advertising spend is the company's budget, managed (not paid) by the systems manager as part of the ongoing role.</w:t>
+      </w:r>
+    </w:p>
+    <w:p>
+      <w:pPr>
+        <w:spacing w:after="110" w:before="240"/>
+      </w:pPr>
+      <w:r>
+        <w:rPr>
+          <w:rFonts w:ascii="Cambria" w:cs="Cambria" w:eastAsia="Cambria" w:hAnsi="Cambria"/>
+          <w:b/>
+          <w:bCs/>
+          <w:color w:val="1F2733"/>
+          <w:sz w:val="26"/>
+          <w:szCs w:val="26"/>
+        </w:rPr>
+        <w:t xml:space="preserve">5. What comes after launch</w:t>
       </w:r>
     </w:p>
     <w:p>

</xml_diff>